<commit_message>
docs: cheat sheet adds install rows, corrects duplicate and top-K algorithm rows
Co-Authored-By: Claude Opus 5.5 <noreply@anthropic.com>
</commit_message>
<xml_diff>
--- a/docs/CHEAT_SHEET.docx
+++ b/docs/CHEAT_SHEET.docx
@@ -769,6 +769,142 @@
           </w:p>
         </w:tc>
       </w:tr>
+      <w:tr>
+        <w:trPr>
+          <w:cantSplit/>
+          <w:tblHeader w:val="off"/>
+        </w:trPr>
+        <w:tc>
+          <w:tcPr>
+            <w:tcW w:type="dxa" w:w="5000"/>
+            <w:tcBorders>
+              <w:top w:val="single" w:color="D5DCE5" w:sz="4"/>
+              <w:left w:val="single" w:color="D5DCE5" w:sz="4"/>
+              <w:bottom w:val="single" w:color="D5DCE5" w:sz="4"/>
+              <w:right w:val="single" w:color="D5DCE5" w:sz="4"/>
+            </w:tcBorders>
+            <w:shd w:fill="FFFFFF" w:color="auto" w:val="clear"/>
+            <w:tcMar>
+              <w:top w:type="dxa" w:w="90"/>
+              <w:left w:type="dxa" w:w="120"/>
+              <w:bottom w:type="dxa" w:w="90"/>
+              <w:right w:type="dxa" w:w="120"/>
+            </w:tcMar>
+          </w:tcPr>
+          <w:p>
+            <w:r>
+              <w:rPr>
+                <w:rFonts w:ascii="Consolas" w:cs="Consolas" w:eastAsia="Consolas" w:hAnsi="Consolas"/>
+                <w:b/>
+                <w:bCs/>
+                <w:color w:val="1F9E89"/>
+                <w:sz w:val="21"/>
+                <w:szCs w:val="21"/>
+              </w:rPr>
+              <w:t xml:space="preserve">release\SpaceRescue-Setup-x64.exe</w:t>
+            </w:r>
+          </w:p>
+        </w:tc>
+        <w:tc>
+          <w:tcPr>
+            <w:tcW w:type="dxa" w:w="4360"/>
+            <w:tcBorders>
+              <w:top w:val="single" w:color="D5DCE5" w:sz="4"/>
+              <w:left w:val="single" w:color="D5DCE5" w:sz="4"/>
+              <w:bottom w:val="single" w:color="D5DCE5" w:sz="4"/>
+              <w:right w:val="single" w:color="D5DCE5" w:sz="4"/>
+            </w:tcBorders>
+            <w:shd w:fill="FFFFFF" w:color="auto" w:val="clear"/>
+            <w:tcMar>
+              <w:top w:type="dxa" w:w="90"/>
+              <w:left w:type="dxa" w:w="120"/>
+              <w:bottom w:type="dxa" w:w="90"/>
+              <w:right w:type="dxa" w:w="120"/>
+            </w:tcMar>
+          </w:tcPr>
+          <w:p>
+            <w:r>
+              <w:rPr>
+                <w:rFonts w:ascii="Calibri" w:cs="Calibri" w:eastAsia="Calibri" w:hAnsi="Calibri"/>
+                <w:b w:val="false"/>
+                <w:bCs w:val="false"/>
+                <w:color w:val="0F1B2D"/>
+                <w:sz w:val="24"/>
+                <w:szCs w:val="24"/>
+              </w:rPr>
+              <w:t xml:space="preserve">Installer to send to anyone: double-click, no admin needed. Uninstall from Settings &gt; Apps.</w:t>
+            </w:r>
+          </w:p>
+        </w:tc>
+      </w:tr>
+      <w:tr>
+        <w:trPr>
+          <w:cantSplit/>
+          <w:tblHeader w:val="off"/>
+        </w:trPr>
+        <w:tc>
+          <w:tcPr>
+            <w:tcW w:type="dxa" w:w="5000"/>
+            <w:tcBorders>
+              <w:top w:val="single" w:color="D5DCE5" w:sz="4"/>
+              <w:left w:val="single" w:color="D5DCE5" w:sz="4"/>
+              <w:bottom w:val="single" w:color="D5DCE5" w:sz="4"/>
+              <w:right w:val="single" w:color="D5DCE5" w:sz="4"/>
+            </w:tcBorders>
+            <w:shd w:fill="F6F8FB" w:color="auto" w:val="clear"/>
+            <w:tcMar>
+              <w:top w:type="dxa" w:w="90"/>
+              <w:left w:type="dxa" w:w="120"/>
+              <w:bottom w:type="dxa" w:w="90"/>
+              <w:right w:type="dxa" w:w="120"/>
+            </w:tcMar>
+          </w:tcPr>
+          <w:p>
+            <w:r>
+              <w:rPr>
+                <w:rFonts w:ascii="Consolas" w:cs="Consolas" w:eastAsia="Consolas" w:hAnsi="Consolas"/>
+                <w:b/>
+                <w:bCs/>
+                <w:color w:val="1F9E89"/>
+                <w:sz w:val="21"/>
+                <w:szCs w:val="21"/>
+              </w:rPr>
+              <w:t xml:space="preserve">release\SpaceRescue-portable.zip</w:t>
+            </w:r>
+          </w:p>
+        </w:tc>
+        <w:tc>
+          <w:tcPr>
+            <w:tcW w:type="dxa" w:w="4360"/>
+            <w:tcBorders>
+              <w:top w:val="single" w:color="D5DCE5" w:sz="4"/>
+              <w:left w:val="single" w:color="D5DCE5" w:sz="4"/>
+              <w:bottom w:val="single" w:color="D5DCE5" w:sz="4"/>
+              <w:right w:val="single" w:color="D5DCE5" w:sz="4"/>
+            </w:tcBorders>
+            <w:shd w:fill="F6F8FB" w:color="auto" w:val="clear"/>
+            <w:tcMar>
+              <w:top w:type="dxa" w:w="90"/>
+              <w:left w:type="dxa" w:w="120"/>
+              <w:bottom w:type="dxa" w:w="90"/>
+              <w:right w:type="dxa" w:w="120"/>
+            </w:tcMar>
+          </w:tcPr>
+          <w:p>
+            <w:r>
+              <w:rPr>
+                <w:rFonts w:ascii="Calibri" w:cs="Calibri" w:eastAsia="Calibri" w:hAnsi="Calibri"/>
+                <w:b w:val="false"/>
+                <w:bCs w:val="false"/>
+                <w:color w:val="0F1B2D"/>
+                <w:sz w:val="24"/>
+                <w:szCs w:val="24"/>
+              </w:rPr>
+              <w:t xml:space="preserve">No-install version: unzip and run SpaceRescue.exe (works from a USB stick).</w:t>
+            </w:r>
+          </w:p>
+        </w:tc>
+      </w:tr>
     </w:tbl>
     <w:p>
       <w:pPr>
@@ -9585,7 +9721,7 @@
                 <w:sz w:val="21"/>
                 <w:szCs w:val="21"/>
               </w:rPr>
-              <w:t xml:space="preserve">Size groups → 64 KB hash → full hash (FNV-1a).</w:t>
+              <w:t xml:space="preserve">Same size → hash of first + last 64 KB → full-file hash (FNV-1a).</w:t>
             </w:r>
           </w:p>
         </w:tc>
@@ -9913,7 +10049,7 @@
                 <w:sz w:val="21"/>
                 <w:szCs w:val="21"/>
               </w:rPr>
-              <w:t xml:space="preserve">Top-K largest</w:t>
+              <w:t xml:space="preserve">Top-K most fragmented</w:t>
             </w:r>
           </w:p>
         </w:tc>
@@ -9944,7 +10080,7 @@
                 <w:sz w:val="21"/>
                 <w:szCs w:val="21"/>
               </w:rPr>
-              <w:t xml:space="preserve">200 tallest kids without sorting everyone.</w:t>
+              <w:t xml:space="preserve">Find the 200 messiest rooms without ranking every room.</w:t>
             </w:r>
           </w:p>
         </w:tc>
@@ -9975,7 +10111,7 @@
                 <w:sz w:val="21"/>
                 <w:szCs w:val="21"/>
               </w:rPr>
-              <w:t xml:space="preserve">std::partial_sort (heap select); O(n log k).</w:t>
+              <w:t xml:space="preserve">std::partial_sort over extent counts keeps the top 200; O(n log k).</w:t>
             </w:r>
           </w:p>
         </w:tc>

</xml_diff>